<commit_message>
Update policy brief docx to freshly generated version
</commit_message>
<xml_diff>
--- a/grantguard_D_policy_brief.docx
+++ b/grantguard_D_policy_brief.docx
@@ -201,7 +201,7 @@
           <w:sz w:val="20"/>
           <w:szCs w:val="20"/>
         </w:rPr>
-        <w:t xml:space="preserve">Government procurement is among the most corruption-prone activities in public administration. Conservative OECD estimates suggest 20-25% of procurement spending — roughly $154B annually in the United States and CAD$6B in Canada — is lost to corruption, collusion, or structural inefficiency. This is not primarily a detection failure. It is an incentive structure failure: the expected payoff from corruption exceeds the expected cost of getting caught.</w:t>
+        <w:t xml:space="preserve">Government procurement is among the most corruption-prone activities in public administration. Conservative OECD estimates suggest 20-25% of procurement spending is lost to corruption, collusion, or structural inefficiency. This represents roughly $154B annually in the United States and CAD$7.4B in Canada. This is not primarily a detection failure. It is an incentive structure failure: the expected payoff from corruption exceeds the expected cost of getting caught.</w:t>
       </w:r>
     </w:p>
     <w:p>
@@ -254,7 +254,7 @@
                 <w:sz w:val="19"/>
                 <w:szCs w:val="19"/>
               </w:rPr>
-              <w:t xml:space="preserve">Key fact: A firm that bribes a single reviewer to inflate a proposal score on a $10M contract, when bribing costs $50,000, faces an expected return of $3-4M. No detection system can be effective if the underlying incentive math remains this favorable to corruption.</w:t>
+              <w:t xml:space="preserve">Key fact: A firm that bribes a single reviewer on a $10M contract, at a cost of $50,000, faces an expected return of $3-4M. No detection system can be effective if the underlying incentive math remains this favorable to corruption.</w:t>
             </w:r>
           </w:p>
         </w:tc>
@@ -281,7 +281,7 @@
           <w:sz w:val="36"/>
           <w:szCs w:val="36"/>
         </w:rPr>
-        <w:t xml:space="preserve">What GrantGuard Does — and Does Not Do</w:t>
+        <w:t xml:space="preserve">What GrantGuard Does</w:t>
       </w:r>
     </w:p>
     <w:p>
@@ -296,7 +296,7 @@
           <w:sz w:val="20"/>
           <w:szCs w:val="20"/>
         </w:rPr>
-        <w:t xml:space="preserve">GrantGuard does not eliminate corruption. No system can. What it does is change the economics: it increases coordination costs, raises detection probability, and reduces payoff certainty. The goal is to make corruption economically irrational for 12 of the 15 documented attack vectors — meaning the expected return drops below the cost.</w:t>
+        <w:t xml:space="preserve">GrantGuard does not eliminate corruption. What it does is change the economics: it increases coordination costs, raises detection probability, and reduces payoff certainty. The goal is to make corruption economically irrational for 12 of the 15 documented attack vectors.</w:t>
       </w:r>
     </w:p>
     <w:p>
@@ -305,21 +305,6 @@
           <w:rFonts w:ascii="Arial" w:cs="Arial" w:eastAsia="Arial" w:hAnsi="Arial"/>
         </w:rPr>
         <w:t xml:space="preserve"> </w:t>
-      </w:r>
-    </w:p>
-    <w:p>
-      <w:pPr>
-        <w:spacing w:after="120" w:before="80"/>
-        <w:jc w:val="both"/>
-      </w:pPr>
-      <w:r>
-        <w:rPr>
-          <w:rFonts w:ascii="Arial" w:cs="Arial" w:eastAsia="Arial" w:hAnsi="Arial"/>
-          <w:color w:val="222222"/>
-          <w:sz w:val="20"/>
-          <w:szCs w:val="20"/>
-        </w:rPr>
-        <w:t xml:space="preserve">Three categories of intervention:</w:t>
       </w:r>
     </w:p>
     <w:p>
@@ -337,7 +322,7 @@
           <w:sz w:val="20"/>
           <w:szCs w:val="20"/>
         </w:rPr>
-        <w:t xml:space="preserve">Structural deterrence: making corruption harder and more expensive to execute (randomised reviewer assignment, cryptographic commit-reveal, randomised selection function)</w:t>
+        <w:t xml:space="preserve">Structural deterrence: randomised reviewer assignment, cryptographic commit-reveal, randomised selection function</w:t>
       </w:r>
     </w:p>
     <w:p>
@@ -355,7 +340,7 @@
           <w:sz w:val="20"/>
           <w:szCs w:val="20"/>
         </w:rPr>
-        <w:t xml:space="preserve">Detection and attribution: identifying corruption signals early and accurately (12-indicator CIM, ML classifier, whistleblower integration, network graph analysis)</w:t>
+        <w:t xml:space="preserve">Detection and attribution: 12-indicator CIM, ML classifier, whistleblower integration, network graph analysis</w:t>
       </w:r>
     </w:p>
     <w:p>
@@ -373,7 +358,7 @@
           <w:sz w:val="20"/>
           <w:szCs w:val="20"/>
         </w:rPr>
-        <w:t xml:space="preserve">Consequence amplification: ensuring detected corruption leads to outcomes (automated GAO/OAG referral, CITT pathway, FCA qui tam routing, public disclosure)</w:t>
+        <w:t xml:space="preserve">Consequence amplification: automated GAO/OAG referral, CITT pathway, FCA qui tam routing, public disclosure</w:t>
       </w:r>
     </w:p>
     <w:p>
@@ -397,7 +382,7 @@
           <w:sz w:val="36"/>
           <w:szCs w:val="36"/>
         </w:rPr>
-        <w:t xml:space="preserve">The Three Things That Cannot Be Fixed Algorithmically</w:t>
+        <w:t xml:space="preserve">Three Things That Cannot Be Fixed Algorithmically</w:t>
       </w:r>
     </w:p>
     <w:tbl>
@@ -442,7 +427,7 @@
                 <w:sz w:val="19"/>
                 <w:szCs w:val="19"/>
               </w:rPr>
-              <w:t xml:space="preserve">Policymakers should be clear-eyed about what GrantGuard cannot do. These three vulnerabilities require institutional, legislative, or constitutional responses that algorithms cannot substitute for.</w:t>
+              <w:t xml:space="preserve">Policymakers should be clear-eyed about what GrantGuard cannot do. These three vulnerabilities require institutional, legislative, or constitutional responses.</w:t>
             </w:r>
           </w:p>
         </w:tc>
@@ -468,7 +453,7 @@
           <w:sz w:val="20"/>
           <w:szCs w:val="20"/>
         </w:rPr>
-        <w:t xml:space="preserve">First, specification gaming. When a procurement consulting industry emerges that optimizes proposals for scoring rubrics rather than actual project quality, no detection mechanism catches it because the proposals technically comply with all rules. The solution is partially confidential rubrics with post-submission reveal, combined with qualitative human review by evaluators who were not involved in rubric design. This is a process reform, not a technology fix.</w:t>
+        <w:t xml:space="preserve">Specification gaming. When a procurement consulting industry optimises proposals for scoring rubrics rather than actual project quality, no detection mechanism catches it because the proposals technically comply with all rules. The solution is partially confidential rubrics with post-submission reveal, combined with qualitative human review. This is a process reform, not a technology fix.</w:t>
       </w:r>
     </w:p>
     <w:p>
@@ -491,7 +476,7 @@
           <w:sz w:val="20"/>
           <w:szCs w:val="20"/>
         </w:rPr>
-        <w:t xml:space="preserve">Second, democratic capture. When reviewers systematically score politically connected applicants more favorably out of anticipated consequences for their own careers, this is statistically detectable only in retrospect — years after the damage is done, through post-award performance analysis. The solution is independent oversight bodies with genuine political insulation and subpoena power. Technology can surface the pattern; only institutions can address the cause.</w:t>
+        <w:t xml:space="preserve">Democratic capture. When reviewers systematically score politically connected applicants more favourably out of anticipated career consequences, this is detectable only in retrospect through post-award performance analysis. Technology can surface the pattern. Only institutions can address the cause.</w:t>
       </w:r>
     </w:p>
     <w:p>
@@ -514,7 +499,7 @@
           <w:sz w:val="20"/>
           <w:szCs w:val="20"/>
         </w:rPr>
-        <w:t xml:space="preserve">Third, complete institutional capture. If the ministry, agency, or oversight function is itself under the control of corrupt actors, no within-system mechanism survives. GrantGuard assumes a minimum threshold of institutional integrity in the oversight layer. Below that threshold, the problem is constitutional, not technical.</w:t>
+        <w:t xml:space="preserve">Complete institutional capture. If the ministry or oversight function is itself corrupt, no within-system mechanism survives. This is a constitutional problem, not a technical one.</w:t>
       </w:r>
     </w:p>
     <w:p>
@@ -538,53 +523,7 @@
           <w:sz w:val="36"/>
           <w:szCs w:val="36"/>
         </w:rPr>
-        <w:t xml:space="preserve">The Economic Case in Plain Terms</w:t>
-      </w:r>
-    </w:p>
-    <w:p>
-      <w:pPr>
-        <w:spacing w:after="120" w:before="80"/>
-        <w:jc w:val="both"/>
-      </w:pPr>
-      <w:r>
-        <w:rPr>
-          <w:rFonts w:ascii="Arial" w:cs="Arial" w:eastAsia="Arial" w:hAnsi="Arial"/>
-          <w:color w:val="222222"/>
-          <w:sz w:val="20"/>
-          <w:szCs w:val="20"/>
-        </w:rPr>
-        <w:t xml:space="preserve">United States: The federal government spends roughly $700 billion per year on contracts and grants. Recovering 18% of the estimated 22% that is currently wasted generates approximately $27.7 billion per year in better-spent money — funds that either achieve their intended programmatic purpose or remain unspent. The cost to build, deploy, and operate GrantGuard across all federal agencies over ten years is approximately $377 million. The ten-year savings under the moderate scenario exceed $262 billion. This is not a close call.</w:t>
-      </w:r>
-    </w:p>
-    <w:p>
-      <w:r>
-        <w:rPr>
-          <w:rFonts w:ascii="Arial" w:cs="Arial" w:eastAsia="Arial" w:hAnsi="Arial"/>
-        </w:rPr>
-        <w:t xml:space="preserve"> </w:t>
-      </w:r>
-    </w:p>
-    <w:p>
-      <w:pPr>
-        <w:spacing w:after="120" w:before="80"/>
-        <w:jc w:val="both"/>
-      </w:pPr>
-      <w:r>
-        <w:rPr>
-          <w:rFonts w:ascii="Arial" w:cs="Arial" w:eastAsia="Arial" w:hAnsi="Arial"/>
-          <w:color w:val="222222"/>
-          <w:sz w:val="20"/>
-          <w:szCs w:val="20"/>
-        </w:rPr>
-        <w:t xml:space="preserve">Canada: Federal procurement of approximately CAD$30 billion per year loses an estimated CAD$6 billion to waste and corruption. GrantGuard at moderate effectiveness recovers CAD$1.08 billion per year. The ten-year cost is CAD$86 million. The ten-year return is CAD$10.1 billion. The ratio is approximately 117:1.</w:t>
-      </w:r>
-    </w:p>
-    <w:p>
-      <w:r>
-        <w:rPr>
-          <w:rFonts w:ascii="Arial" w:cs="Arial" w:eastAsia="Arial" w:hAnsi="Arial"/>
-        </w:rPr>
-        <w:t xml:space="preserve"> </w:t>
+        <w:t xml:space="preserve">The Economic Case</w:t>
       </w:r>
     </w:p>
     <w:tbl>
@@ -849,7 +788,7 @@
                 <w:sz w:val="18"/>
                 <w:szCs w:val="18"/>
               </w:rPr>
-              <w:t xml:space="preserve">$30B (~$22B USD)</w:t>
+              <w:t xml:space="preserve">$37B (~$27B USD)</w:t>
             </w:r>
           </w:p>
         </w:tc>
@@ -884,7 +823,7 @@
                 <w:sz w:val="18"/>
                 <w:szCs w:val="18"/>
               </w:rPr>
-              <w:t xml:space="preserve">$722B</w:t>
+              <w:t xml:space="preserve">$727B</w:t>
             </w:r>
           </w:p>
         </w:tc>
@@ -991,7 +930,7 @@
                 <w:sz w:val="18"/>
                 <w:szCs w:val="18"/>
               </w:rPr>
-              <w:t xml:space="preserve">$6B (~$4.4B)</w:t>
+              <w:t xml:space="preserve">$7.4B (~$5.4B)</w:t>
             </w:r>
           </w:p>
         </w:tc>
@@ -1026,7 +965,7 @@
                 <w:sz w:val="18"/>
                 <w:szCs w:val="18"/>
               </w:rPr>
-              <w:t xml:space="preserve">$158B</w:t>
+              <w:t xml:space="preserve">$159B</w:t>
             </w:r>
           </w:p>
         </w:tc>
@@ -1781,7 +1720,7 @@
           <w:sz w:val="20"/>
           <w:szCs w:val="20"/>
         </w:rPr>
-        <w:t xml:space="preserve">Mandate GrantGuard pilot for civilian contracts $1M-$50M within 18 months, with GSA as lead agency (US) or PSPC for professional services category (Canada). Pilots generate the clean historical data the ML classifier needs to reach full effectiveness.</w:t>
+        <w:t xml:space="preserve">Mandate GrantGuard pilot for civilian contracts $1M-$50M within 18 months, with GSA as lead agency (US) or PSPC for professional services (Canada). Pilots generate the clean historical data the ML classifier needs.</w:t>
       </w:r>
     </w:p>
     <w:p>
@@ -1807,7 +1746,7 @@
           <w:sz w:val="20"/>
           <w:szCs w:val="20"/>
         </w:rPr>
-        <w:t xml:space="preserve">Strengthen False Claims Act / PSDPA whistleblower provisions. The FCA qui tam mechanism recovered $2.68B in FY2023 alone. Canada's PSDPA offers no financial incentive and has a structural disclosure rate of ~100 cases per year vs. thousands in the US. Amending the PSDPA to include a financial reward for verified fraud disclosures is the single highest-leverage legislative change available.</w:t>
+        <w:t xml:space="preserve">Strengthen False Claims Act / PSDPA whistleblower provisions. The FCA qui tam mechanism recovered $2.68B in FY2023. Canada's PSDPA offers no financial incentive and generates ~100 cases per year. Amending the PSDPA to include financial rewards for verified fraud disclosures is the single highest-leverage legislative change available.</w:t>
       </w:r>
     </w:p>
     <w:p>
@@ -1833,7 +1772,7 @@
           <w:sz w:val="20"/>
           <w:szCs w:val="20"/>
         </w:rPr>
-        <w:t xml:space="preserve">Require minimum bidder counts and bid windows in statute, not just regulation. FAR requirements for 30-day posting windows are routinely waived. Making minimum competition requirements statutory — with criminal penalties for unjustified waivers — removes the discretionary space that the most common corruption patterns exploit.</w:t>
+        <w:t xml:space="preserve">Require minimum bidder counts and bid windows in statute, not just regulation. FAR requirements for 30-day posting windows are routinely waived. Making minimum competition requirements statutory removes the discretionary space that common corruption patterns exploit.</w:t>
       </w:r>
     </w:p>
     <w:p>
@@ -1859,7 +1798,7 @@
           <w:sz w:val="20"/>
           <w:szCs w:val="20"/>
         </w:rPr>
-        <w:t xml:space="preserve">Create an independent procurement integrity office with audit authority over both the procuring agencies and the evaluation process itself. In both the US and Canada, the internal audit function is housed within the procuring agency — a structural conflict of interest. An independent office modeled on the UK's National Audit Office or the EU's OLAF, with cross-agency jurisdiction, fills the institutional gap that algorithms cannot.</w:t>
+        <w:t xml:space="preserve">Create an independent procurement integrity office with audit authority over both procuring agencies and the evaluation process. Internal audit housed within the procuring agency is a structural conflict of interest.</w:t>
       </w:r>
     </w:p>
     <w:p>
@@ -1885,7 +1824,7 @@
           <w:sz w:val="20"/>
           <w:szCs w:val="20"/>
         </w:rPr>
-        <w:t xml:space="preserve">Begin post-quantum cryptography migration now. NIST published final post-quantum standards in 2024 (FIPS 203, 204, 205). The current commit-reveal protocol in GrantGuard uses SHAKE-256, which provides quantum resistance for the hash function, but the full signature scheme requires migration to ML-DSA (FIPS 204) by the 2030 deadline. Delaying the architecture decision now creates a migration crisis later when quantum computing capabilities mature.</w:t>
+        <w:t xml:space="preserve">Begin post-quantum cryptography migration now. NIST published final PQC standards in 2024 (FIPS 203, 204, 205). Migration to ML-DSA by the 2030 deadline must begin now to avoid a crisis when quantum computing capabilities mature.</w:t>
       </w:r>
     </w:p>
     <w:p>
@@ -1954,35 +1893,12 @@
                 <w:sz w:val="19"/>
                 <w:szCs w:val="19"/>
               </w:rPr>
-              <w:t xml:space="preserve">GrantGuard V6 is deployment-ready for 12 of 15 documented attack vectors, with formal theoretical grounding, empirical calibration to EU/US/Canadian procurement data, and jurisdiction-specific legal compliance for both FAR and GCR/CFTA frameworks. The three remaining vulnerabilities require institutional action, not further algorithm development. The economic case across all scenarios and both jurisdictions is unambiguous. The primary constraint on deployment is institutional will, not technical readiness.</w:t>
+              <w:t xml:space="preserve">GrantGuard V6 is deployment-ready for 12 of 15 documented attack vectors, with formal theoretical grounding, empirical calibration to EU/US/Canadian data, and jurisdiction-specific legal compliance for both FAR and GCR/CFTA frameworks. The three remaining vulnerabilities require institutional action, not further algorithm development. The economic case across all scenarios and both jurisdictions is unambiguous. The primary constraint on deployment is institutional will, not technical readiness.</w:t>
             </w:r>
           </w:p>
         </w:tc>
       </w:tr>
     </w:tbl>
-    <w:p>
-      <w:r>
-        <w:rPr>
-          <w:rFonts w:ascii="Arial" w:cs="Arial" w:eastAsia="Arial" w:hAnsi="Arial"/>
-        </w:rPr>
-        <w:t xml:space="preserve"> </w:t>
-      </w:r>
-    </w:p>
-    <w:p>
-      <w:pPr>
-        <w:spacing w:after="120" w:before="80"/>
-        <w:jc w:val="both"/>
-      </w:pPr>
-      <w:r>
-        <w:rPr>
-          <w:rFonts w:ascii="Arial" w:cs="Arial" w:eastAsia="Arial" w:hAnsi="Arial"/>
-          <w:color w:val="222222"/>
-          <w:sz w:val="20"/>
-          <w:szCs w:val="20"/>
-        </w:rPr>
-        <w:t xml:space="preserve">This brief summarises findings from a five-version iterative development process including 80+ Monte Carlo simulation runs per attack scenario, cross-algorithm validation against Byzantine Fault Tolerance, VCG mechanism design, Bayesian Truth Serum, EigenTrust, and robust statistics literature, and live testing of all jurisdiction-specific modules against empirically documented corruption patterns from US FPDS-NG, Canadian PSPC audit reports, and EU Structural Funds data.</w:t>
-      </w:r>
-    </w:p>
     <w:sectPr>
       <w:pgSz w:w="12240" w:h="15840" w:orient="portrait"/>
       <w:pgMar w:top="1080" w:right="1080" w:bottom="1080" w:left="1080" w:header="708" w:footer="708" w:gutter="0"/>

</xml_diff>